<commit_message>
Deploying to gh-pages from @ Morrison-Lab/sds@4760649d4a15e97a4d69c5130b40647dc26cf644 🚀
</commit_message>
<xml_diff>
--- a/permutation-tests-handout.docx
+++ b/permutation-tests-handout.docx
@@ -15,7 +15,7 @@
         <w:pStyle w:val="Date"/>
       </w:pPr>
       <w:r>
-        <w:t xml:space="preserve">Last modified: 2026-10-12 22:10:07 (PDT)</w:t>
+        <w:t xml:space="preserve">Last modified: 2026-10-12 23:11:59 (PDT)</w:t>
       </w:r>
     </w:p>
     <w:p>
@@ -13382,7 +13382,7 @@
         <w:rPr>
           <w:rStyle w:val="NormalTok"/>
         </w:rPr>
-        <w:t xml:space="preserve">expression </w:t>
+        <w:t xml:space="preserve">expr_matrix </w:t>
       </w:r>
       <w:r>
         <w:rPr>
@@ -14132,7 +14132,7 @@
         <w:rPr>
           <w:rStyle w:val="NormalTok"/>
         </w:rPr>
-        <w:t xml:space="preserve">(expression, in_class4)</w:t>
+        <w:t xml:space="preserve">(expr_matrix, in_class4)</w:t>
       </w:r>
       <w:r>
         <w:br/>
@@ -14382,7 +14382,7 @@
         <w:rPr>
           <w:rStyle w:val="NormalTok"/>
         </w:rPr>
-        <w:t xml:space="preserve">(expression, </w:t>
+        <w:t xml:space="preserve">(expr_matrix, </w:t>
       </w:r>
       <w:r>
         <w:rPr>
@@ -15018,7 +15018,7 @@
         <w:rPr>
           <w:rStyle w:val="NormalTok"/>
         </w:rPr>
-        <w:t xml:space="preserve">(expression),</w:t>
+        <w:t xml:space="preserve">(expr_matrix),</w:t>
       </w:r>
       <w:r>
         <w:br/>

</xml_diff>

<commit_message>
Deploying to gh-pages from @ Morrison-Lab/sds@44eff021da82a5e9582687683919a715ceaecf7d 🚀
</commit_message>
<xml_diff>
--- a/permutation-tests-handout.docx
+++ b/permutation-tests-handout.docx
@@ -15,7 +15,7 @@
         <w:pStyle w:val="Date"/>
       </w:pPr>
       <w:r>
-        <w:t xml:space="preserve">Last modified: 2026-10-18 13:22:01 (PDT)</w:t>
+        <w:t xml:space="preserve">Last modified: 2026-10-18 13:50:54 (PDT)</w:t>
       </w:r>
     </w:p>
     <w:p>
@@ -16871,13 +16871,19 @@
         </w:numPr>
       </w:pPr>
       <w:r>
-        <w:t xml:space="preserve">Good [3]</w:t>
-      </w:r>
-      <w:r>
-        <w:t xml:space="preserve"> </w:t>
-      </w:r>
-      <w:r>
-        <w:t xml:space="preserve">is a book-length treatment of permutation tests.</w:t>
+        <w:t xml:space="preserve">Good</w:t>
+      </w:r>
+      <w:r>
+        <w:t xml:space="preserve"> </w:t>
+      </w:r>
+      <w:r>
+        <w:t xml:space="preserve">[3]</w:t>
+      </w:r>
+      <w:r>
+        <w:t xml:space="preserve"> </w:t>
+      </w:r>
+      <w:r>
+        <w:t xml:space="preserve">gives a book-length treatment of permutation tests.</w:t>
       </w:r>
     </w:p>
     <w:p>
@@ -16889,13 +16895,36 @@
         </w:numPr>
       </w:pPr>
       <w:r>
-        <w:t xml:space="preserve">Phipson and Smyth [9]</w:t>
-      </w:r>
-      <w:r>
-        <w:t xml:space="preserve"> </w:t>
-      </w:r>
-      <w:r>
-        <w:t xml:space="preserve">explains why Monte Carlo permutation p-values need the added 1.</w:t>
+        <w:t xml:space="preserve">Phipson and Smyth</w:t>
+      </w:r>
+      <w:r>
+        <w:t xml:space="preserve"> </w:t>
+      </w:r>
+      <w:r>
+        <w:t xml:space="preserve">[9]</w:t>
+      </w:r>
+      <w:r>
+        <w:t xml:space="preserve"> </w:t>
+      </w:r>
+      <w:r>
+        <w:t xml:space="preserve">explain why</w:t>
+      </w:r>
+      <w:r>
+        <w:t xml:space="preserve"> </w:t>
+      </w:r>
+      <w:hyperlink w:anchor="def-monte-carlo-p-value">
+        <w:r>
+          <w:rPr>
+            <w:rStyle w:val="Hyperlink"/>
+          </w:rPr>
+          <w:t xml:space="preserve">Monte Carlo permutation p-values</w:t>
+        </w:r>
+      </w:hyperlink>
+      <w:r>
+        <w:t xml:space="preserve"> </w:t>
+      </w:r>
+      <w:r>
+        <w:t xml:space="preserve">need the added 1.</w:t>
       </w:r>
     </w:p>
     <w:p>

</xml_diff>